<commit_message>
mostrar cantidad de productos por categoria y proveedor
- Añade migración `008_entity_product_counts.sql` con las vistas `categories_with_counts` y `suppliers_with_counts`.
- Actualiza tipos de la base de datos y define alias `CategoryWithCount` y `SupplierWithCount`.
- Modifica las Server Actions `getCategories` y `getSuppliers` para consumir las nuevas vistas.
- Agrega columna de "Productos" ordenable en las tablas cliente de Categorías y Proveedores.
</commit_message>
<xml_diff>
--- a/documentacion/Manual de Usuario.docx
+++ b/documentacion/Manual de Usuario.docx
@@ -1259,6 +1259,50 @@
           <w:szCs w:val="22"/>
         </w:rPr>
         <w:t xml:space="preserve">Por seguridad, un administrador no puede modificar su propio rol, evitando que el sistema quede sin administradores.</w:t>
+      </w:r>
+    </w:p>
+    <w:p>
+      <w:pPr>
+        <w:pStyle w:val="Heading2"/>
+      </w:pPr>
+      <w:r>
+        <w:t xml:space="preserve">10.1. Eliminar un usuario</w:t>
+      </w:r>
+    </w:p>
+    <w:p>
+      <w:pPr>
+        <w:spacing w:after="120"/>
+      </w:pPr>
+      <w:r>
+        <w:rPr>
+          <w:sz w:val="22"/>
+          <w:szCs w:val="22"/>
+        </w:rPr>
+        <w:t xml:space="preserve">El administrador puede eliminar un usuario desde el listado, haciendo clic en el ícono de eliminar de la fila correspondiente y confirmando la acción.</w:t>
+      </w:r>
+    </w:p>
+    <w:p>
+      <w:pPr>
+        <w:spacing w:after="120"/>
+      </w:pPr>
+      <w:r>
+        <w:rPr>
+          <w:sz w:val="22"/>
+          <w:szCs w:val="22"/>
+        </w:rPr>
+        <w:t xml:space="preserve">La eliminación es una baja lógica: el usuario deja de figurar en el listado y no puede volver a iniciar sesión, pero su historial de movimientos se conserva. Si un usuario eliminado intenta acceder, el sistema le informa que su cuenta fue eliminada y no le permite el ingreso.</w:t>
+      </w:r>
+    </w:p>
+    <w:p>
+      <w:pPr>
+        <w:spacing w:after="120"/>
+      </w:pPr>
+      <w:r>
+        <w:rPr>
+          <w:sz w:val="22"/>
+          <w:szCs w:val="22"/>
+        </w:rPr>
+        <w:t xml:space="preserve">Por seguridad, un administrador no puede eliminar su propia cuenta ni eliminar al último administrador activo, de modo que el sistema nunca quede sin administración. A diferencia de los demás módulos, la eliminación de un usuario es definitiva y no contempla reactivación desde la interfaz.</w:t>
       </w:r>
     </w:p>
     <w:p>

</xml_diff>